<commit_message>
guide mise à jour
</commit_message>
<xml_diff>
--- a/docs/Guide_utilisation_Gestion_Interventions.docx
+++ b/docs/Guide_utilisation_Gestion_Interventions.docx
@@ -2468,6 +2468,14 @@
     </w:p>
     <w:p>
       <w:pPr>
+        <w:spacing w:after="120"/>
+      </w:pPr>
+      <w:r>
+        <w:t xml:space="preserve">Matériel concerné : quand une intervention passe à Terminée, son matériel est retiré de la colonne «Matériel concerné», car il n'a plus d'utilité. Les interventions Non résolues le conservent (utile pour les renouveler) et les livraisons en magasin gardent leurs articles (ils forment le bon de réception).</w:t>
+      </w:r>
+    </w:p>
+    <w:p>
+      <w:pPr>
         <w:pStyle w:val="Titre1"/>
         <w:spacing w:before="400" w:after="200"/>
       </w:pPr>
@@ -2557,15 +2565,7 @@
         <w:spacing w:after="60"/>
       </w:pPr>
       <w:r>
-        <w:t xml:space="preserve">Si besoin, </w:t>
-      </w:r>
-      <w:proofErr w:type="gramStart"/>
-      <w:r>
-        <w:t>sélectionnez le</w:t>
-      </w:r>
-      <w:proofErr w:type="gramEnd"/>
-      <w:r>
-        <w:t xml:space="preserve"> ou les matériels concernés (facultatif).</w:t>
+        <w:t xml:space="preserve">Si besoin, sélectionnez le ou les matériels concernés (facultatif, sauf pour une livraison en magasin : voir la section 5).</w:t>
       </w:r>
     </w:p>
     <w:p>
@@ -2671,8 +2671,15 @@
         <w:spacing w:before="400" w:after="200"/>
       </w:pPr>
       <w:r>
-        <w:lastRenderedPageBreak/>
-        <w:t>5. Modifier une intervention</w:t>
+        <w:t xml:space="preserve">5. Livraison en magasin (réception de marchandises)</w:t>
+      </w:r>
+    </w:p>
+    <w:p>
+      <w:pPr>
+        <w:spacing w:after="120"/>
+      </w:pPr>
+      <w:r>
+        <w:t xml:space="preserve">Une livraison en magasin sert à enregistrer l'arrivée de marchandises commandées à un fournisseur dans le stock du Magasin (CTM). Quand la livraison est validée par le Manager, les quantités reçues en bon état sont ajoutées automatiquement au stock des matériels : plus besoin de modifier le stock à la main.</w:t>
       </w:r>
     </w:p>
     <w:p>
@@ -2681,78 +2688,423 @@
         <w:spacing w:before="200" w:after="100"/>
       </w:pPr>
       <w:r>
-        <w:t>En tant qu'Admin</w:t>
-      </w:r>
-    </w:p>
-    <w:p>
-      <w:pPr>
-        <w:pStyle w:val="Paragraphedeliste"/>
-        <w:numPr>
-          <w:ilvl w:val="0"/>
-          <w:numId w:val="2"/>
-        </w:numPr>
-        <w:spacing w:after="60"/>
-      </w:pPr>
-      <w:r>
-        <w:t>Cliquez sur</w:t>
-      </w:r>
-      <w:proofErr w:type="gramStart"/>
-      <w:r>
-        <w:t xml:space="preserve"> «Modifier</w:t>
-      </w:r>
-      <w:proofErr w:type="gramEnd"/>
-      <w:r>
-        <w:t>» sur la ligne de l'intervention souhaitée : le formulaire se pré-remplit.</w:t>
-      </w:r>
-    </w:p>
-    <w:p>
-      <w:pPr>
-        <w:pStyle w:val="Paragraphedeliste"/>
-        <w:numPr>
-          <w:ilvl w:val="0"/>
-          <w:numId w:val="2"/>
-        </w:numPr>
-        <w:spacing w:after="60"/>
-      </w:pPr>
-      <w:r>
-        <w:t>Si l'intervention est En cours, En retard ou En attente de validation, une section</w:t>
-      </w:r>
-      <w:proofErr w:type="gramStart"/>
-      <w:r>
-        <w:t xml:space="preserve"> «Suivi</w:t>
-      </w:r>
-      <w:proofErr w:type="gramEnd"/>
-      <w:r>
-        <w:t xml:space="preserve"> technicien / </w:t>
-      </w:r>
-      <w:proofErr w:type="gramStart"/>
-      <w:r>
-        <w:t>manager»</w:t>
-      </w:r>
-      <w:proofErr w:type="gramEnd"/>
-      <w:r>
-        <w:t xml:space="preserve"> apparaît pour consulter/ajuster le diagnostic, les actions réalisées, le résultat et le manager assigné.</w:t>
-      </w:r>
-    </w:p>
-    <w:p>
-      <w:pPr>
-        <w:pStyle w:val="Paragraphedeliste"/>
-        <w:numPr>
-          <w:ilvl w:val="0"/>
-          <w:numId w:val="2"/>
-        </w:numPr>
-        <w:spacing w:after="60"/>
-      </w:pPr>
-      <w:r>
-        <w:t>Cliquez sur</w:t>
-      </w:r>
-      <w:proofErr w:type="gramStart"/>
-      <w:r>
-        <w:t xml:space="preserve"> «Modifier</w:t>
-      </w:r>
-      <w:proofErr w:type="gramEnd"/>
-      <w:r>
-        <w:t>» (bouton jaune) pour enregistrer.</w:t>
+        <w:t xml:space="preserve">Les étapes</w:t>
+      </w:r>
+    </w:p>
+    <w:tbl>
+      <w:tblPr>
+        <w:tblW w:w="9600" w:type="dxa"/>
+        <w:tblBorders>
+          <w:top w:val="single" w:sz="4" w:space="0" w:color="auto"/>
+          <w:left w:val="single" w:sz="4" w:space="0" w:color="auto"/>
+          <w:bottom w:val="single" w:sz="4" w:space="0" w:color="auto"/>
+          <w:right w:val="single" w:sz="4" w:space="0" w:color="auto"/>
+          <w:insideH w:val="single" w:sz="4" w:space="0" w:color="auto"/>
+          <w:insideV w:val="single" w:sz="4" w:space="0" w:color="auto"/>
+        </w:tblBorders>
+        <w:tblLayout w:type="fixed"/>
+        <w:tblCellMar>
+          <w:left w:w="10" w:type="dxa"/>
+          <w:right w:w="10" w:type="dxa"/>
+        </w:tblCellMar>
+        <w:tblLook w:val="0000" w:firstRow="0" w:lastRow="0" w:firstColumn="0" w:lastColumn="0" w:noHBand="0" w:noVBand="0"/>
+      </w:tblPr>
+      <w:tblGrid>
+        <w:gridCol w:w="800"/>
+        <w:gridCol w:w="1800"/>
+        <w:gridCol w:w="4600"/>
+        <w:gridCol w:w="2400"/>
+      </w:tblGrid>
+      <w:tr>
+        <w:trPr>
+          <w:cantSplit/>
+          <w:tblHeader/>
+        </w:trPr>
+        <w:tc>
+          <w:tcPr>
+            <w:tcW w:w="800" w:type="dxa"/>
+            <w:shd w:val="clear" w:color="auto" w:fill="0074C7"/>
+            <w:tcMar>
+              <w:top w:w="80" w:type="dxa"/>
+              <w:left w:w="120" w:type="dxa"/>
+              <w:bottom w:w="80" w:type="dxa"/>
+              <w:right w:w="120" w:type="dxa"/>
+            </w:tcMar>
+          </w:tcPr>
+          <w:p>
+            <w:r>
+              <w:rPr>
+                <w:b/>
+                <w:bCs/>
+                <w:color w:val="FFFFFF"/>
+              </w:rPr>
+              <w:t xml:space="preserve">Étape</w:t>
+            </w:r>
+          </w:p>
+        </w:tc>
+        <w:tc>
+          <w:tcPr>
+            <w:tcW w:w="1800" w:type="dxa"/>
+            <w:shd w:val="clear" w:color="auto" w:fill="0074C7"/>
+            <w:tcMar>
+              <w:top w:w="80" w:type="dxa"/>
+              <w:left w:w="120" w:type="dxa"/>
+              <w:bottom w:w="80" w:type="dxa"/>
+              <w:right w:w="120" w:type="dxa"/>
+            </w:tcMar>
+          </w:tcPr>
+          <w:p>
+            <w:r>
+              <w:rPr>
+                <w:b/>
+                <w:bCs/>
+                <w:color w:val="FFFFFF"/>
+              </w:rPr>
+              <w:t xml:space="preserve">Qui</w:t>
+            </w:r>
+          </w:p>
+        </w:tc>
+        <w:tc>
+          <w:tcPr>
+            <w:tcW w:w="4600" w:type="dxa"/>
+            <w:shd w:val="clear" w:color="auto" w:fill="0074C7"/>
+            <w:tcMar>
+              <w:top w:w="80" w:type="dxa"/>
+              <w:left w:w="120" w:type="dxa"/>
+              <w:bottom w:w="80" w:type="dxa"/>
+              <w:right w:w="120" w:type="dxa"/>
+            </w:tcMar>
+          </w:tcPr>
+          <w:p>
+            <w:r>
+              <w:rPr>
+                <w:b/>
+                <w:bCs/>
+                <w:color w:val="FFFFFF"/>
+              </w:rPr>
+              <w:t xml:space="preserve">Ce qui se passe</w:t>
+            </w:r>
+          </w:p>
+        </w:tc>
+        <w:tc>
+          <w:tcPr>
+            <w:tcW w:w="2400" w:type="dxa"/>
+            <w:shd w:val="clear" w:color="auto" w:fill="0074C7"/>
+            <w:tcMar>
+              <w:top w:w="80" w:type="dxa"/>
+              <w:left w:w="120" w:type="dxa"/>
+              <w:bottom w:w="80" w:type="dxa"/>
+              <w:right w:w="120" w:type="dxa"/>
+            </w:tcMar>
+          </w:tcPr>
+          <w:p>
+            <w:r>
+              <w:rPr>
+                <w:b/>
+                <w:bCs/>
+                <w:color w:val="FFFFFF"/>
+              </w:rPr>
+              <w:t xml:space="preserve">Résultat</w:t>
+            </w:r>
+          </w:p>
+        </w:tc>
+      </w:tr>
+      <w:tr>
+        <w:trPr>
+          <w:cantSplit/>
+        </w:trPr>
+        <w:tc>
+          <w:tcPr>
+            <w:tcW w:w="800" w:type="dxa"/>
+            <w:shd w:val="clear" w:color="auto" w:fill="FFFFFF"/>
+            <w:tcMar>
+              <w:top w:w="80" w:type="dxa"/>
+              <w:left w:w="120" w:type="dxa"/>
+              <w:bottom w:w="80" w:type="dxa"/>
+              <w:right w:w="120" w:type="dxa"/>
+            </w:tcMar>
+          </w:tcPr>
+          <w:p>
+            <w:r>
+              <w:t xml:space="preserve">1</w:t>
+            </w:r>
+          </w:p>
+        </w:tc>
+        <w:tc>
+          <w:tcPr>
+            <w:tcW w:w="1800" w:type="dxa"/>
+            <w:shd w:val="clear" w:color="auto" w:fill="FFFFFF"/>
+            <w:tcMar>
+              <w:top w:w="80" w:type="dxa"/>
+              <w:left w:w="120" w:type="dxa"/>
+              <w:bottom w:w="80" w:type="dxa"/>
+              <w:right w:w="120" w:type="dxa"/>
+            </w:tcMar>
+          </w:tcPr>
+          <w:p>
+            <w:r>
+              <w:t xml:space="preserve">Admin ou Intervenant</w:t>
+            </w:r>
+          </w:p>
+        </w:tc>
+        <w:tc>
+          <w:tcPr>
+            <w:tcW w:w="4600" w:type="dxa"/>
+            <w:shd w:val="clear" w:color="auto" w:fill="FFFFFF"/>
+            <w:tcMar>
+              <w:top w:w="80" w:type="dxa"/>
+              <w:left w:w="120" w:type="dxa"/>
+              <w:bottom w:w="80" w:type="dxa"/>
+              <w:right w:w="120" w:type="dxa"/>
+            </w:tcMar>
+          </w:tcPr>
+          <w:p>
+            <w:r>
+              <w:t xml:space="preserve">Crée une intervention de type «Livraison en magasin» : fournisseur (obligatoire), n° de bon de livraison, puis les articles attendus avec leur quantité.</w:t>
+            </w:r>
+          </w:p>
+        </w:tc>
+        <w:tc>
+          <w:tcPr>
+            <w:tcW w:w="2400" w:type="dxa"/>
+            <w:shd w:val="clear" w:color="auto" w:fill="FFFFFF"/>
+            <w:tcMar>
+              <w:top w:w="80" w:type="dxa"/>
+              <w:left w:w="120" w:type="dxa"/>
+              <w:bottom w:w="80" w:type="dxa"/>
+              <w:right w:w="120" w:type="dxa"/>
+            </w:tcMar>
+          </w:tcPr>
+          <w:p>
+            <w:r>
+              <w:t xml:space="preserve">Statut «Demande». Le service «Magasin» (site CTM) est présélectionné.</w:t>
+            </w:r>
+          </w:p>
+        </w:tc>
+      </w:tr>
+      <w:tr>
+        <w:trPr>
+          <w:cantSplit/>
+        </w:trPr>
+        <w:tc>
+          <w:tcPr>
+            <w:tcW w:w="800" w:type="dxa"/>
+            <w:shd w:val="clear" w:color="auto" w:fill="F2F8FD"/>
+            <w:tcMar>
+              <w:top w:w="80" w:type="dxa"/>
+              <w:left w:w="120" w:type="dxa"/>
+              <w:bottom w:w="80" w:type="dxa"/>
+              <w:right w:w="120" w:type="dxa"/>
+            </w:tcMar>
+          </w:tcPr>
+          <w:p>
+            <w:r>
+              <w:t xml:space="preserve">2</w:t>
+            </w:r>
+          </w:p>
+        </w:tc>
+        <w:tc>
+          <w:tcPr>
+            <w:tcW w:w="1800" w:type="dxa"/>
+            <w:shd w:val="clear" w:color="auto" w:fill="F2F8FD"/>
+            <w:tcMar>
+              <w:top w:w="80" w:type="dxa"/>
+              <w:left w:w="120" w:type="dxa"/>
+              <w:bottom w:w="80" w:type="dxa"/>
+              <w:right w:w="120" w:type="dxa"/>
+            </w:tcMar>
+          </w:tcPr>
+          <w:p>
+            <w:r>
+              <w:t xml:space="preserve">Technicien</w:t>
+            </w:r>
+          </w:p>
+        </w:tc>
+        <w:tc>
+          <w:tcPr>
+            <w:tcW w:w="4600" w:type="dxa"/>
+            <w:shd w:val="clear" w:color="auto" w:fill="F2F8FD"/>
+            <w:tcMar>
+              <w:top w:w="80" w:type="dxa"/>
+              <w:left w:w="120" w:type="dxa"/>
+              <w:bottom w:w="80" w:type="dxa"/>
+              <w:right w:w="120" w:type="dxa"/>
+            </w:tcMar>
+          </w:tcPr>
+          <w:p>
+            <w:r>
+              <w:t xml:space="preserve">Dans «Compléter l'intervention», saisit pour chaque article la quantité réellement reçue et son état (Conforme ou Abîmé), puis clique sur «Envoyer au Manager».</w:t>
+            </w:r>
+          </w:p>
+        </w:tc>
+        <w:tc>
+          <w:tcPr>
+            <w:tcW w:w="2400" w:type="dxa"/>
+            <w:shd w:val="clear" w:color="auto" w:fill="F2F8FD"/>
+            <w:tcMar>
+              <w:top w:w="80" w:type="dxa"/>
+              <w:left w:w="120" w:type="dxa"/>
+              <w:bottom w:w="80" w:type="dxa"/>
+              <w:right w:w="120" w:type="dxa"/>
+            </w:tcMar>
+          </w:tcPr>
+          <w:p>
+            <w:r>
+              <w:t xml:space="preserve">Statut «En attente de validation».</w:t>
+            </w:r>
+          </w:p>
+        </w:tc>
+      </w:tr>
+      <w:tr>
+        <w:trPr>
+          <w:cantSplit/>
+        </w:trPr>
+        <w:tc>
+          <w:tcPr>
+            <w:tcW w:w="800" w:type="dxa"/>
+            <w:shd w:val="clear" w:color="auto" w:fill="FFFFFF"/>
+            <w:tcMar>
+              <w:top w:w="80" w:type="dxa"/>
+              <w:left w:w="120" w:type="dxa"/>
+              <w:bottom w:w="80" w:type="dxa"/>
+              <w:right w:w="120" w:type="dxa"/>
+            </w:tcMar>
+          </w:tcPr>
+          <w:p>
+            <w:r>
+              <w:t xml:space="preserve">3</w:t>
+            </w:r>
+          </w:p>
+        </w:tc>
+        <w:tc>
+          <w:tcPr>
+            <w:tcW w:w="1800" w:type="dxa"/>
+            <w:shd w:val="clear" w:color="auto" w:fill="FFFFFF"/>
+            <w:tcMar>
+              <w:top w:w="80" w:type="dxa"/>
+              <w:left w:w="120" w:type="dxa"/>
+              <w:bottom w:w="80" w:type="dxa"/>
+              <w:right w:w="120" w:type="dxa"/>
+            </w:tcMar>
+          </w:tcPr>
+          <w:p>
+            <w:r>
+              <w:t xml:space="preserve">Manager</w:t>
+            </w:r>
+          </w:p>
+        </w:tc>
+        <w:tc>
+          <w:tcPr>
+            <w:tcW w:w="4600" w:type="dxa"/>
+            <w:shd w:val="clear" w:color="auto" w:fill="FFFFFF"/>
+            <w:tcMar>
+              <w:top w:w="80" w:type="dxa"/>
+              <w:left w:w="120" w:type="dxa"/>
+              <w:bottom w:w="80" w:type="dxa"/>
+              <w:right w:w="120" w:type="dxa"/>
+            </w:tcMar>
+          </w:tcPr>
+          <w:p>
+            <w:r>
+              <w:t xml:space="preserve">Contrôle la livraison : pour chaque article il voit «reçu X / attendu Y» et la mention ÉCART si la livraison est incomplète. Il choisit «Terminée» ou «Non résolue».</w:t>
+            </w:r>
+          </w:p>
+        </w:tc>
+        <w:tc>
+          <w:tcPr>
+            <w:tcW w:w="2400" w:type="dxa"/>
+            <w:shd w:val="clear" w:color="auto" w:fill="FFFFFF"/>
+            <w:tcMar>
+              <w:top w:w="80" w:type="dxa"/>
+              <w:left w:w="120" w:type="dxa"/>
+              <w:bottom w:w="80" w:type="dxa"/>
+              <w:right w:w="120" w:type="dxa"/>
+            </w:tcMar>
+          </w:tcPr>
+          <w:p>
+            <w:r>
+              <w:t xml:space="preserve">Si «Terminée» : le stock est mis à jour.</w:t>
+            </w:r>
+          </w:p>
+        </w:tc>
+      </w:tr>
+      <w:tr>
+        <w:trPr>
+          <w:cantSplit/>
+        </w:trPr>
+        <w:tc>
+          <w:tcPr>
+            <w:tcW w:w="800" w:type="dxa"/>
+            <w:shd w:val="clear" w:color="auto" w:fill="F2F8FD"/>
+            <w:tcMar>
+              <w:top w:w="80" w:type="dxa"/>
+              <w:left w:w="120" w:type="dxa"/>
+              <w:bottom w:w="80" w:type="dxa"/>
+              <w:right w:w="120" w:type="dxa"/>
+            </w:tcMar>
+          </w:tcPr>
+          <w:p>
+            <w:r>
+              <w:t xml:space="preserve">4</w:t>
+            </w:r>
+          </w:p>
+        </w:tc>
+        <w:tc>
+          <w:tcPr>
+            <w:tcW w:w="1800" w:type="dxa"/>
+            <w:shd w:val="clear" w:color="auto" w:fill="F2F8FD"/>
+            <w:tcMar>
+              <w:top w:w="80" w:type="dxa"/>
+              <w:left w:w="120" w:type="dxa"/>
+              <w:bottom w:w="80" w:type="dxa"/>
+              <w:right w:w="120" w:type="dxa"/>
+            </w:tcMar>
+          </w:tcPr>
+          <w:p>
+            <w:r>
+              <w:t xml:space="preserve">Tous</w:t>
+            </w:r>
+          </w:p>
+        </w:tc>
+        <w:tc>
+          <w:tcPr>
+            <w:tcW w:w="4600" w:type="dxa"/>
+            <w:shd w:val="clear" w:color="auto" w:fill="F2F8FD"/>
+            <w:tcMar>
+              <w:top w:w="80" w:type="dxa"/>
+              <w:left w:w="120" w:type="dxa"/>
+              <w:bottom w:w="80" w:type="dxa"/>
+              <w:right w:w="120" w:type="dxa"/>
+            </w:tcMar>
+          </w:tcPr>
+          <w:p>
+            <w:r>
+              <w:t xml:space="preserve">Le bouton «Imprimer» (interventions Terminées ou Non résolues) ouvre la fiche, qui contient aussi le bon de réception.</w:t>
+            </w:r>
+          </w:p>
+        </w:tc>
+        <w:tc>
+          <w:tcPr>
+            <w:tcW w:w="2400" w:type="dxa"/>
+            <w:shd w:val="clear" w:color="auto" w:fill="F2F8FD"/>
+            <w:tcMar>
+              <w:top w:w="80" w:type="dxa"/>
+              <w:left w:w="120" w:type="dxa"/>
+              <w:bottom w:w="80" w:type="dxa"/>
+              <w:right w:w="120" w:type="dxa"/>
+            </w:tcMar>
+          </w:tcPr>
+          <w:p>
+            <w:r>
+              <w:t xml:space="preserve">Fournisseur, n° de BL, quantités attendues et reçues, état.</w:t>
+            </w:r>
+          </w:p>
+        </w:tc>
+      </w:tr>
+    </w:tbl>
+    <w:p>
+      <w:r>
+        <w:br w:type="page"/>
       </w:r>
     </w:p>
     <w:p>
@@ -2761,115 +3113,59 @@
         <w:spacing w:before="200" w:after="100"/>
       </w:pPr>
       <w:r>
-        <w:t>En tant que Technicien</w:t>
-      </w:r>
-    </w:p>
-    <w:p>
-      <w:pPr>
-        <w:pStyle w:val="Paragraphedeliste"/>
-        <w:numPr>
-          <w:ilvl w:val="0"/>
-          <w:numId w:val="2"/>
-        </w:numPr>
-        <w:spacing w:after="60"/>
-      </w:pPr>
-      <w:r>
-        <w:t>Depuis le Dashboard Technicien, renseignez si besoin la date et l'heure de début, la date et l'heure de fin, puis le diagnostic, les actions réalisées, le résultat, et ajoutez une photo si besoin.</w:t>
-      </w:r>
-    </w:p>
-    <w:p>
-      <w:pPr>
-        <w:pStyle w:val="Paragraphedeliste"/>
-        <w:numPr>
-          <w:ilvl w:val="0"/>
-          <w:numId w:val="2"/>
-        </w:numPr>
-        <w:spacing w:after="60"/>
-      </w:pPr>
-      <w:r>
-        <w:t>Cliquez sur</w:t>
-      </w:r>
-      <w:proofErr w:type="gramStart"/>
-      <w:r>
-        <w:t xml:space="preserve"> «Compléter</w:t>
-      </w:r>
-      <w:proofErr w:type="gramEnd"/>
-      <w:r>
-        <w:t xml:space="preserve"> </w:t>
-      </w:r>
-      <w:proofErr w:type="gramStart"/>
-      <w:r>
-        <w:t>l'intervention»</w:t>
-      </w:r>
-      <w:proofErr w:type="gramEnd"/>
-      <w:r>
-        <w:t xml:space="preserve"> (bouton jaune) : l'intervention passe en</w:t>
-      </w:r>
-      <w:proofErr w:type="gramStart"/>
-      <w:r>
-        <w:t xml:space="preserve"> «En</w:t>
-      </w:r>
-      <w:proofErr w:type="gramEnd"/>
-      <w:r>
-        <w:t xml:space="preserve"> attente de </w:t>
-      </w:r>
-      <w:proofErr w:type="gramStart"/>
-      <w:r>
-        <w:t>validation»</w:t>
-      </w:r>
-      <w:proofErr w:type="gramEnd"/>
-      <w:r>
-        <w:t>.</w:t>
-      </w:r>
-    </w:p>
-    <w:p>
-      <w:pPr>
-        <w:pStyle w:val="Paragraphedeliste"/>
-        <w:numPr>
-          <w:ilvl w:val="0"/>
-          <w:numId w:val="2"/>
-        </w:numPr>
-        <w:spacing w:after="60"/>
-      </w:pPr>
-      <w:r>
-        <w:t>Cliquez sur</w:t>
-      </w:r>
-      <w:proofErr w:type="gramStart"/>
-      <w:r>
-        <w:t xml:space="preserve"> «Envoyer</w:t>
-      </w:r>
-      <w:proofErr w:type="gramEnd"/>
-      <w:r>
-        <w:t xml:space="preserve"> au </w:t>
-      </w:r>
-      <w:proofErr w:type="gramStart"/>
-      <w:r>
-        <w:t>Manager»</w:t>
-      </w:r>
-      <w:proofErr w:type="gramEnd"/>
-      <w:r>
-        <w:t xml:space="preserve"> : l'intervention est envoyée à votre Manager (celui auquel vous êtes rattaché, non modifiable) et la confirmation</w:t>
-      </w:r>
-      <w:proofErr w:type="gramStart"/>
-      <w:r>
-        <w:t xml:space="preserve"> «Intervention</w:t>
-      </w:r>
-      <w:proofErr w:type="gramEnd"/>
-      <w:r>
-        <w:t xml:space="preserve"> envoyé au Manager !» s'affiche.</w:t>
-      </w:r>
-    </w:p>
-    <w:p>
-      <w:pPr>
-        <w:pStyle w:val="Paragraphedeliste"/>
-        <w:numPr>
-          <w:ilvl w:val="0"/>
-          <w:numId w:val="2"/>
-        </w:numPr>
-        <w:spacing w:after="60"/>
-      </w:pPr>
-      <w:r>
-        <w:t>Si vous n'êtes rattaché à aucun Manager, l'envoi est refusé : demandez à un Manager de vous ajouter à son équipe.</w:t>
+        <w:t xml:space="preserve">Créer la livraison (Admin ou Intervenant)</w:t>
+      </w:r>
+    </w:p>
+    <w:p>
+      <w:pPr>
+        <w:pStyle w:val="Paragraphedeliste"/>
+        <w:numPr>
+          <w:ilvl w:val="0"/>
+          <w:numId w:val="2"/>
+        </w:numPr>
+        <w:spacing w:after="60"/>
+      </w:pPr>
+      <w:r>
+        <w:t xml:space="preserve">Choisissez le type d'intervention «Livraison en magasin» : un encadré apparaît avec les champs «Fournisseur» et «N° de bon de livraison / de commande».</w:t>
+      </w:r>
+    </w:p>
+    <w:p>
+      <w:pPr>
+        <w:pStyle w:val="Paragraphedeliste"/>
+        <w:numPr>
+          <w:ilvl w:val="0"/>
+          <w:numId w:val="2"/>
+        </w:numPr>
+        <w:spacing w:after="60"/>
+      </w:pPr>
+      <w:r>
+        <w:t xml:space="preserve">Sélectionnez les articles attendus dans la liste du stock («Articles attendus»), puis indiquez la quantité attendue de chacun.</w:t>
+      </w:r>
+    </w:p>
+    <w:p>
+      <w:pPr>
+        <w:pStyle w:val="Paragraphedeliste"/>
+        <w:numPr>
+          <w:ilvl w:val="0"/>
+          <w:numId w:val="2"/>
+        </w:numPr>
+        <w:spacing w:after="60"/>
+      </w:pPr>
+      <w:r>
+        <w:t xml:space="preserve">Si un article n'existe pas encore dans le stock, cliquez sur «Nouvel article (absent du stock)», renseignez son type, son nom et la quantité attendue, puis «Créer et ajouter à la livraison». Il est créé avec un stock de 0.</w:t>
+      </w:r>
+    </w:p>
+    <w:p>
+      <w:pPr>
+        <w:pStyle w:val="Paragraphedeliste"/>
+        <w:numPr>
+          <w:ilvl w:val="0"/>
+          <w:numId w:val="2"/>
+        </w:numPr>
+        <w:spacing w:after="60"/>
+      </w:pPr>
+      <w:r>
+        <w:t xml:space="preserve">Une livraison doit contenir au moins un article, sinon l'enregistrement est refusé.</w:t>
       </w:r>
     </w:p>
     <w:p>
@@ -2878,86 +3174,85 @@
         <w:spacing w:before="200" w:after="100"/>
       </w:pPr>
       <w:r>
-        <w:t>En tant que Manager</w:t>
-      </w:r>
-    </w:p>
-    <w:p>
-      <w:pPr>
-        <w:pStyle w:val="Paragraphedeliste"/>
-        <w:numPr>
-          <w:ilvl w:val="0"/>
-          <w:numId w:val="2"/>
-        </w:numPr>
-        <w:spacing w:after="60"/>
-      </w:pPr>
-      <w:r>
-        <w:t>Ouvrez</w:t>
-      </w:r>
-      <w:proofErr w:type="gramStart"/>
-      <w:r>
-        <w:t xml:space="preserve"> «Gestion</w:t>
-      </w:r>
-      <w:proofErr w:type="gramEnd"/>
-      <w:r>
-        <w:t xml:space="preserve"> </w:t>
-      </w:r>
-      <w:proofErr w:type="gramStart"/>
-      <w:r>
-        <w:t>utilisateurs»</w:t>
-      </w:r>
-      <w:proofErr w:type="gramEnd"/>
-      <w:r>
-        <w:t xml:space="preserve"> pour ajouter des techniciens à votre équipe ou en retirer.</w:t>
-      </w:r>
-    </w:p>
-    <w:p>
-      <w:pPr>
-        <w:pStyle w:val="Paragraphedeliste"/>
-        <w:numPr>
-          <w:ilvl w:val="0"/>
-          <w:numId w:val="2"/>
-        </w:numPr>
-        <w:spacing w:after="60"/>
-      </w:pPr>
-      <w:r>
-        <w:t>Depuis le Dashboard Manager, consultez les interventions en attente de validation envoyées par vos techniciens.</w:t>
-      </w:r>
-    </w:p>
-    <w:p>
-      <w:pPr>
-        <w:pStyle w:val="Paragraphedeliste"/>
-        <w:numPr>
-          <w:ilvl w:val="0"/>
-          <w:numId w:val="2"/>
-        </w:numPr>
-        <w:spacing w:after="60"/>
-      </w:pPr>
-      <w:r>
-        <w:t>Choisissez</w:t>
-      </w:r>
-      <w:proofErr w:type="gramStart"/>
-      <w:r>
-        <w:t xml:space="preserve"> «Terminée</w:t>
-      </w:r>
-      <w:proofErr w:type="gramEnd"/>
-      <w:r>
-        <w:t>» ou</w:t>
-      </w:r>
-      <w:proofErr w:type="gramStart"/>
-      <w:r>
-        <w:t xml:space="preserve"> «Non</w:t>
-      </w:r>
-      <w:proofErr w:type="gramEnd"/>
-      <w:r>
-        <w:t xml:space="preserve"> </w:t>
-      </w:r>
-      <w:proofErr w:type="gramStart"/>
-      <w:r>
-        <w:t>résolue»</w:t>
-      </w:r>
-      <w:proofErr w:type="gramEnd"/>
-      <w:r>
-        <w:t xml:space="preserve"> pour valider définitivement l'intervention.</w:t>
+        <w:t xml:space="preserve">Règles à connaître</w:t>
+      </w:r>
+    </w:p>
+    <w:p>
+      <w:pPr>
+        <w:pStyle w:val="Paragraphedeliste"/>
+        <w:numPr>
+          <w:ilvl w:val="0"/>
+          <w:numId w:val="2"/>
+        </w:numPr>
+        <w:spacing w:after="60"/>
+      </w:pPr>
+      <w:r>
+        <w:t xml:space="preserve">Seules les quantités reçues «Conformes» sont ajoutées au stock : un article «Abîmé» est refusé et n'entre pas en stock.</w:t>
+      </w:r>
+    </w:p>
+    <w:p>
+      <w:pPr>
+        <w:pStyle w:val="Paragraphedeliste"/>
+        <w:numPr>
+          <w:ilvl w:val="0"/>
+          <w:numId w:val="2"/>
+        </w:numPr>
+        <w:spacing w:after="60"/>
+      </w:pPr>
+      <w:r>
+        <w:t xml:space="preserve">Livraison incomplète : le Technicien saisit la quantité réellement reçue ; seule cette quantité est ajoutée au stock.</w:t>
+      </w:r>
+    </w:p>
+    <w:p>
+      <w:pPr>
+        <w:pStyle w:val="Paragraphedeliste"/>
+        <w:numPr>
+          <w:ilvl w:val="0"/>
+          <w:numId w:val="2"/>
+        </w:numPr>
+        <w:spacing w:after="60"/>
+      </w:pPr>
+      <w:r>
+        <w:t xml:space="preserve">Le stock n'est mis à jour qu'une seule fois, au moment où le Manager valide «Terminée». «Non résolue» ne modifie pas le stock.</w:t>
+      </w:r>
+    </w:p>
+    <w:p>
+      <w:pPr>
+        <w:pStyle w:val="Paragraphedeliste"/>
+        <w:numPr>
+          <w:ilvl w:val="0"/>
+          <w:numId w:val="2"/>
+        </w:numPr>
+        <w:spacing w:after="60"/>
+      </w:pPr>
+      <w:r>
+        <w:t xml:space="preserve">Le Technicien ne peut pas envoyer la livraison au Manager tant que la quantité reçue de chaque article n'est pas renseignée.</w:t>
+      </w:r>
+    </w:p>
+    <w:p>
+      <w:pPr>
+        <w:pStyle w:val="Paragraphedeliste"/>
+        <w:numPr>
+          <w:ilvl w:val="0"/>
+          <w:numId w:val="2"/>
+        </w:numPr>
+        <w:spacing w:after="60"/>
+      </w:pPr>
+      <w:r>
+        <w:t xml:space="preserve">Tant que le stock n'a pas été mis à jour, l'Admin ou l'Intervenant peut corriger le fournisseur, le n° de bon et les articles avec le bouton «Modifier».</w:t>
+      </w:r>
+    </w:p>
+    <w:p>
+      <w:pPr>
+        <w:pStyle w:val="Paragraphedeliste"/>
+        <w:numPr>
+          <w:ilvl w:val="0"/>
+          <w:numId w:val="2"/>
+        </w:numPr>
+        <w:spacing w:after="60"/>
+      </w:pPr>
+      <w:r>
+        <w:t xml:space="preserve">Le demandeur reçoit l'email habituel, complété du fournisseur, du n° de bon et du détail des articles reçus.</w:t>
       </w:r>
     </w:p>
     <w:p>
@@ -2966,106 +3261,307 @@
         <w:spacing w:before="400" w:after="200"/>
       </w:pPr>
       <w:r>
-        <w:t>6. Fonctionnalités utiles</w:t>
-      </w:r>
-    </w:p>
-    <w:p>
-      <w:pPr>
-        <w:pStyle w:val="Paragraphedeliste"/>
-        <w:numPr>
-          <w:ilvl w:val="0"/>
-          <w:numId w:val="2"/>
-        </w:numPr>
-        <w:spacing w:after="60"/>
-      </w:pPr>
-      <w:r>
-        <w:t>Impression : le bouton</w:t>
+        <w:lastRenderedPageBreak/>
+        <w:t xml:space="preserve">6. Modifier une intervention</w:t>
+      </w:r>
+    </w:p>
+    <w:p>
+      <w:pPr>
+        <w:pStyle w:val="Titre3"/>
+        <w:spacing w:before="200" w:after="100"/>
+      </w:pPr>
+      <w:r>
+        <w:t>En tant qu'Admin</w:t>
+      </w:r>
+    </w:p>
+    <w:p>
+      <w:pPr>
+        <w:pStyle w:val="Paragraphedeliste"/>
+        <w:numPr>
+          <w:ilvl w:val="0"/>
+          <w:numId w:val="2"/>
+        </w:numPr>
+        <w:spacing w:after="60"/>
+      </w:pPr>
+      <w:r>
+        <w:t>Cliquez sur</w:t>
       </w:r>
       <w:proofErr w:type="gramStart"/>
       <w:r>
-        <w:t xml:space="preserve"> «Imprimer</w:t>
+        <w:t xml:space="preserve"> «Modifier</w:t>
       </w:r>
       <w:proofErr w:type="gramEnd"/>
       <w:r>
-        <w:t>» (disponible sur les interventions Terminées et Non résolues) ouvre une fiche imprimable prête à signer, avec le nom du technicien.</w:t>
-      </w:r>
-    </w:p>
-    <w:p>
-      <w:pPr>
-        <w:pStyle w:val="Paragraphedeliste"/>
-        <w:numPr>
-          <w:ilvl w:val="0"/>
-          <w:numId w:val="2"/>
-        </w:numPr>
-        <w:spacing w:after="60"/>
-      </w:pPr>
-      <w:r>
-        <w:t>Renouveler : recrée une nouvelle intervention à partir d'une intervention Non résolue, en conservant les informations de base et en réinitialisant le suivi technicien/manager.</w:t>
-      </w:r>
-    </w:p>
-    <w:p>
-      <w:pPr>
-        <w:pStyle w:val="Paragraphedeliste"/>
-        <w:numPr>
-          <w:ilvl w:val="0"/>
-          <w:numId w:val="2"/>
-        </w:numPr>
-        <w:spacing w:after="60"/>
-      </w:pPr>
-      <w:r>
-        <w:t>Notification email automatique : dès qu'une intervention devient Terminée ou Non résolue, le demandeur reçoit un email récapitulatif avec la photo jointe si elle existe.</w:t>
-      </w:r>
-    </w:p>
-    <w:p>
-      <w:pPr>
-        <w:pStyle w:val="Paragraphedeliste"/>
-        <w:numPr>
-          <w:ilvl w:val="0"/>
-          <w:numId w:val="2"/>
-        </w:numPr>
-        <w:spacing w:after="60"/>
-      </w:pPr>
-      <w:r>
-        <w:t>Suppression automatique : les interventions Terminées de plus d'un an sont supprimées automatiquement pour ne pas surcharger la base de données.</w:t>
-      </w:r>
-    </w:p>
-    <w:p>
-      <w:pPr>
-        <w:pStyle w:val="Paragraphedeliste"/>
-        <w:numPr>
-          <w:ilvl w:val="0"/>
-          <w:numId w:val="2"/>
-        </w:numPr>
-        <w:spacing w:after="60"/>
-      </w:pPr>
-      <w:r>
-        <w:t>Mot de passe oublié : un lien de réinitialisation peut être envoyé par email depuis la page de connexion.</w:t>
-      </w:r>
-    </w:p>
-    <w:p>
-      <w:pPr>
-        <w:spacing w:after="60"/>
-      </w:pPr>
-    </w:p>
-    <w:p>
-      <w:pPr>
-        <w:spacing w:after="60"/>
-      </w:pPr>
-    </w:p>
-    <w:p>
-      <w:pPr>
-        <w:spacing w:after="60"/>
-      </w:pPr>
-    </w:p>
-    <w:p>
-      <w:pPr>
-        <w:spacing w:after="60"/>
-      </w:pPr>
-    </w:p>
-    <w:p>
-      <w:pPr>
-        <w:spacing w:after="60"/>
-      </w:pPr>
+        <w:t>» sur la ligne de l'intervention souhaitée : le formulaire se pré-remplit.</w:t>
+      </w:r>
+    </w:p>
+    <w:p>
+      <w:pPr>
+        <w:pStyle w:val="Paragraphedeliste"/>
+        <w:numPr>
+          <w:ilvl w:val="0"/>
+          <w:numId w:val="2"/>
+        </w:numPr>
+        <w:spacing w:after="60"/>
+      </w:pPr>
+      <w:r>
+        <w:t>Si l'intervention est En cours, En retard ou En attente de validation, une section</w:t>
+      </w:r>
+      <w:proofErr w:type="gramStart"/>
+      <w:r>
+        <w:t xml:space="preserve"> «Suivi</w:t>
+      </w:r>
+      <w:proofErr w:type="gramEnd"/>
+      <w:r>
+        <w:t xml:space="preserve"> technicien / </w:t>
+      </w:r>
+      <w:proofErr w:type="gramStart"/>
+      <w:r>
+        <w:t>manager»</w:t>
+      </w:r>
+      <w:proofErr w:type="gramEnd"/>
+      <w:r>
+        <w:t xml:space="preserve"> apparaît pour consulter/ajuster le diagnostic, les actions réalisées, le résultat et le manager assigné.</w:t>
+      </w:r>
+    </w:p>
+    <w:p>
+      <w:pPr>
+        <w:pStyle w:val="Paragraphedeliste"/>
+        <w:numPr>
+          <w:ilvl w:val="0"/>
+          <w:numId w:val="2"/>
+        </w:numPr>
+        <w:spacing w:after="60"/>
+      </w:pPr>
+      <w:r>
+        <w:t xml:space="preserve">Pour une livraison en magasin, vous pouvez aussi corriger le fournisseur, le n° de bon et les articles attendus (tant que le stock n'a pas été mis à jour).</w:t>
+      </w:r>
+    </w:p>
+    <w:p>
+      <w:pPr>
+        <w:pStyle w:val="Paragraphedeliste"/>
+        <w:numPr>
+          <w:ilvl w:val="0"/>
+          <w:numId w:val="2"/>
+        </w:numPr>
+        <w:spacing w:after="60"/>
+      </w:pPr>
+      <w:r>
+        <w:t>Cliquez sur</w:t>
+      </w:r>
+      <w:proofErr w:type="gramStart"/>
+      <w:r>
+        <w:t xml:space="preserve"> «Modifier</w:t>
+      </w:r>
+      <w:proofErr w:type="gramEnd"/>
+      <w:r>
+        <w:t>» (bouton jaune) pour enregistrer.</w:t>
+      </w:r>
+    </w:p>
+    <w:p>
+      <w:pPr>
+        <w:pStyle w:val="Titre3"/>
+        <w:spacing w:before="200" w:after="100"/>
+      </w:pPr>
+      <w:r>
+        <w:t>En tant que Technicien</w:t>
+      </w:r>
+    </w:p>
+    <w:p>
+      <w:pPr>
+        <w:pStyle w:val="Paragraphedeliste"/>
+        <w:numPr>
+          <w:ilvl w:val="0"/>
+          <w:numId w:val="2"/>
+        </w:numPr>
+        <w:spacing w:after="60"/>
+      </w:pPr>
+      <w:r>
+        <w:t>Depuis le Dashboard Technicien, renseignez si besoin la date et l'heure de début, la date et l'heure de fin, puis le diagnostic, les actions réalisées, le résultat, et ajoutez une photo si besoin.</w:t>
+      </w:r>
+    </w:p>
+    <w:p>
+      <w:pPr>
+        <w:pStyle w:val="Paragraphedeliste"/>
+        <w:numPr>
+          <w:ilvl w:val="0"/>
+          <w:numId w:val="2"/>
+        </w:numPr>
+        <w:spacing w:after="60"/>
+      </w:pPr>
+      <w:r>
+        <w:t>Cliquez sur</w:t>
+      </w:r>
+      <w:proofErr w:type="gramStart"/>
+      <w:r>
+        <w:t xml:space="preserve"> «Compléter</w:t>
+      </w:r>
+      <w:proofErr w:type="gramEnd"/>
+      <w:r>
+        <w:t xml:space="preserve"> </w:t>
+      </w:r>
+      <w:proofErr w:type="gramStart"/>
+      <w:r>
+        <w:t>l'intervention»</w:t>
+      </w:r>
+      <w:proofErr w:type="gramEnd"/>
+      <w:r>
+        <w:t xml:space="preserve"> (bouton jaune) : l'intervention passe en</w:t>
+      </w:r>
+      <w:proofErr w:type="gramStart"/>
+      <w:r>
+        <w:t xml:space="preserve"> «En</w:t>
+      </w:r>
+      <w:proofErr w:type="gramEnd"/>
+      <w:r>
+        <w:t xml:space="preserve"> attente de </w:t>
+      </w:r>
+      <w:proofErr w:type="gramStart"/>
+      <w:r>
+        <w:t>validation»</w:t>
+      </w:r>
+      <w:proofErr w:type="gramEnd"/>
+      <w:r>
+        <w:t>.</w:t>
+      </w:r>
+    </w:p>
+    <w:p>
+      <w:pPr>
+        <w:pStyle w:val="Paragraphedeliste"/>
+        <w:numPr>
+          <w:ilvl w:val="0"/>
+          <w:numId w:val="2"/>
+        </w:numPr>
+        <w:spacing w:after="60"/>
+      </w:pPr>
+      <w:r>
+        <w:t>Cliquez sur</w:t>
+      </w:r>
+      <w:proofErr w:type="gramStart"/>
+      <w:r>
+        <w:t xml:space="preserve"> «Envoyer</w:t>
+      </w:r>
+      <w:proofErr w:type="gramEnd"/>
+      <w:r>
+        <w:t xml:space="preserve"> au </w:t>
+      </w:r>
+      <w:proofErr w:type="gramStart"/>
+      <w:r>
+        <w:t>Manager»</w:t>
+      </w:r>
+      <w:proofErr w:type="gramEnd"/>
+      <w:r>
+        <w:t xml:space="preserve"> : l'intervention est envoyée à votre Manager (celui auquel vous êtes rattaché, non modifiable) et la confirmation</w:t>
+      </w:r>
+      <w:proofErr w:type="gramStart"/>
+      <w:r>
+        <w:t xml:space="preserve"> «Intervention</w:t>
+      </w:r>
+      <w:proofErr w:type="gramEnd"/>
+      <w:r>
+        <w:t xml:space="preserve"> envoyé au Manager !» s'affiche.</w:t>
+      </w:r>
+    </w:p>
+    <w:p>
+      <w:pPr>
+        <w:pStyle w:val="Paragraphedeliste"/>
+        <w:numPr>
+          <w:ilvl w:val="0"/>
+          <w:numId w:val="2"/>
+        </w:numPr>
+        <w:spacing w:after="60"/>
+      </w:pPr>
+      <w:r>
+        <w:t>Si vous n'êtes rattaché à aucun Manager, l'envoi est refusé : demandez à un Manager de vous ajouter à son équipe.</w:t>
+      </w:r>
+    </w:p>
+    <w:p>
+      <w:pPr>
+        <w:pStyle w:val="Titre3"/>
+        <w:spacing w:before="200" w:after="100"/>
+      </w:pPr>
+      <w:r>
+        <w:t>En tant que Manager</w:t>
+      </w:r>
+    </w:p>
+    <w:p>
+      <w:pPr>
+        <w:pStyle w:val="Paragraphedeliste"/>
+        <w:numPr>
+          <w:ilvl w:val="0"/>
+          <w:numId w:val="2"/>
+        </w:numPr>
+        <w:spacing w:after="60"/>
+      </w:pPr>
+      <w:r>
+        <w:t>Ouvrez</w:t>
+      </w:r>
+      <w:proofErr w:type="gramStart"/>
+      <w:r>
+        <w:t xml:space="preserve"> «Gestion</w:t>
+      </w:r>
+      <w:proofErr w:type="gramEnd"/>
+      <w:r>
+        <w:t xml:space="preserve"> </w:t>
+      </w:r>
+      <w:proofErr w:type="gramStart"/>
+      <w:r>
+        <w:t>utilisateurs»</w:t>
+      </w:r>
+      <w:proofErr w:type="gramEnd"/>
+      <w:r>
+        <w:t xml:space="preserve"> pour ajouter des techniciens à votre équipe ou en retirer.</w:t>
+      </w:r>
+    </w:p>
+    <w:p>
+      <w:pPr>
+        <w:pStyle w:val="Paragraphedeliste"/>
+        <w:numPr>
+          <w:ilvl w:val="0"/>
+          <w:numId w:val="2"/>
+        </w:numPr>
+        <w:spacing w:after="60"/>
+      </w:pPr>
+      <w:r>
+        <w:t>Depuis le Dashboard Manager, consultez les interventions en attente de validation envoyées par vos techniciens.</w:t>
+      </w:r>
+    </w:p>
+    <w:p>
+      <w:pPr>
+        <w:pStyle w:val="Paragraphedeliste"/>
+        <w:numPr>
+          <w:ilvl w:val="0"/>
+          <w:numId w:val="2"/>
+        </w:numPr>
+        <w:spacing w:after="60"/>
+      </w:pPr>
+      <w:r>
+        <w:t>Choisissez</w:t>
+      </w:r>
+      <w:proofErr w:type="gramStart"/>
+      <w:r>
+        <w:t xml:space="preserve"> «Terminée</w:t>
+      </w:r>
+      <w:proofErr w:type="gramEnd"/>
+      <w:r>
+        <w:t>» ou</w:t>
+      </w:r>
+      <w:proofErr w:type="gramStart"/>
+      <w:r>
+        <w:t xml:space="preserve"> «Non</w:t>
+      </w:r>
+      <w:proofErr w:type="gramEnd"/>
+      <w:r>
+        <w:t xml:space="preserve"> </w:t>
+      </w:r>
+      <w:proofErr w:type="gramStart"/>
+      <w:r>
+        <w:t>résolue»</w:t>
+      </w:r>
+      <w:proofErr w:type="gramEnd"/>
+      <w:r>
+        <w:t xml:space="preserve"> pour valider définitivement l'intervention.</w:t>
+      </w:r>
     </w:p>
     <w:p>
       <w:pPr>
@@ -3073,8 +3569,87 @@
         <w:spacing w:before="400" w:after="200"/>
       </w:pPr>
       <w:r>
+        <w:t xml:space="preserve">7. Fonctionnalités utiles</w:t>
+      </w:r>
+    </w:p>
+    <w:p>
+      <w:pPr>
+        <w:pStyle w:val="Paragraphedeliste"/>
+        <w:numPr>
+          <w:ilvl w:val="0"/>
+          <w:numId w:val="2"/>
+        </w:numPr>
+        <w:spacing w:after="60"/>
+      </w:pPr>
+      <w:r>
+        <w:t xml:space="preserve">Impression : le bouton «Imprimer» (disponible sur les interventions Terminées et Non résolues) ouvre une fiche imprimable prête à signer, avec le nom du technicien. Pour une livraison en magasin, la fiche contient en plus le bon de réception (articles attendus, reçus, état et ajout au stock).</w:t>
+      </w:r>
+    </w:p>
+    <w:p>
+      <w:pPr>
+        <w:pStyle w:val="Paragraphedeliste"/>
+        <w:numPr>
+          <w:ilvl w:val="0"/>
+          <w:numId w:val="2"/>
+        </w:numPr>
+        <w:spacing w:after="60"/>
+      </w:pPr>
+      <w:r>
+        <w:t>Renouveler : recrée une nouvelle intervention à partir d'une intervention Non résolue, en conservant les informations de base et en réinitialisant le suivi technicien/manager.</w:t>
+      </w:r>
+    </w:p>
+    <w:p>
+      <w:pPr>
+        <w:pStyle w:val="Paragraphedeliste"/>
+        <w:numPr>
+          <w:ilvl w:val="0"/>
+          <w:numId w:val="2"/>
+        </w:numPr>
+        <w:spacing w:after="60"/>
+      </w:pPr>
+      <w:r>
+        <w:t>Notification email automatique : dès qu'une intervention devient Terminée ou Non résolue, le demandeur reçoit un email récapitulatif avec la photo jointe si elle existe.</w:t>
+      </w:r>
+    </w:p>
+    <w:p>
+      <w:pPr>
+        <w:pStyle w:val="Paragraphedeliste"/>
+        <w:numPr>
+          <w:ilvl w:val="0"/>
+          <w:numId w:val="2"/>
+        </w:numPr>
+        <w:spacing w:after="60"/>
+      </w:pPr>
+      <w:r>
+        <w:t>Suppression automatique : les interventions Terminées de plus d'un an sont supprimées automatiquement pour ne pas surcharger la base de données.</w:t>
+      </w:r>
+    </w:p>
+    <w:p>
+      <w:pPr>
+        <w:pStyle w:val="Paragraphedeliste"/>
+        <w:numPr>
+          <w:ilvl w:val="0"/>
+          <w:numId w:val="2"/>
+        </w:numPr>
+        <w:spacing w:after="60"/>
+      </w:pPr>
+      <w:r>
+        <w:t>Mot de passe oublié : un lien de réinitialisation peut être envoyé par email depuis la page de connexion.</w:t>
+      </w:r>
+    </w:p>
+    <w:p>
+      <w:pPr>
+        <w:spacing w:after="60"/>
+      </w:pPr>
+    </w:p>
+    <w:p>
+      <w:pPr>
+        <w:pStyle w:val="Titre1"/>
+        <w:spacing w:before="400" w:after="200"/>
+      </w:pPr>
+      <w:r>
         <w:lastRenderedPageBreak/>
-        <w:t>7. En cas de problème</w:t>
+        <w:t xml:space="preserve">8. En cas de problème</w:t>
       </w:r>
     </w:p>
     <w:p>
@@ -3201,6 +3776,45 @@
       <w:proofErr w:type="gramEnd"/>
       <w:r>
         <w:t xml:space="preserve"> en local et dans les variables d'environnement de Render en ligne.</w:t>
+      </w:r>
+    </w:p>
+    <w:p>
+      <w:pPr>
+        <w:pStyle w:val="Paragraphedeliste"/>
+        <w:numPr>
+          <w:ilvl w:val="0"/>
+          <w:numId w:val="2"/>
+        </w:numPr>
+        <w:spacing w:after="60"/>
+      </w:pPr>
+      <w:r>
+        <w:t xml:space="preserve">«Cette livraison ne contient aucun article» (Technicien) : les articles attendus n'ont pas été enregistrés. L'Admin ou l'Intervenant doit modifier l'intervention, ajouter les articles attendus, puis enregistrer.</w:t>
+      </w:r>
+    </w:p>
+    <w:p>
+      <w:pPr>
+        <w:pStyle w:val="Paragraphedeliste"/>
+        <w:numPr>
+          <w:ilvl w:val="0"/>
+          <w:numId w:val="2"/>
+        </w:numPr>
+        <w:spacing w:after="60"/>
+      </w:pPr>
+      <w:r>
+        <w:t xml:space="preserve">«Renseignez la quantité reçue de chaque article avant d'envoyer la livraison au manager» : saisissez la quantité reçue de tous les articles dans «Compléter l'intervention», puis envoyez.</w:t>
+      </w:r>
+    </w:p>
+    <w:p>
+      <w:pPr>
+        <w:pStyle w:val="Paragraphedeliste"/>
+        <w:numPr>
+          <w:ilvl w:val="0"/>
+          <w:numId w:val="2"/>
+        </w:numPr>
+        <w:spacing w:after="60"/>
+      </w:pPr>
+      <w:r>
+        <w:t xml:space="preserve">Le stock d'un article n'a pas changé après une livraison : le stock n'est mis à jour qu'à la validation «Terminée» du Manager, et seulement pour les quantités reçues «Conformes».</w:t>
       </w:r>
     </w:p>
     <w:sectPr>

</xml_diff>